<commit_message>
docs: update acknowledgements in documents and README
</commit_message>
<xml_diff>
--- a/Makalah dari Penyuka Idol Banyak Makan.docx
+++ b/Makalah dari Penyuka Idol Banyak Makan.docx
@@ -12449,46 +12449,7 @@
         </w:rPr>
       </w:pPr>
       <w:r>
-        <w:rPr>
-          <w:lang w:val="it-IT"/>
-        </w:rPr>
-        <w:t>Tuliskan ucapan terima kasih</w:t>
-      </w:r>
-      <w:r>
-        <w:rPr>
-          <w:lang w:val="it-IT"/>
-        </w:rPr>
-        <w:t xml:space="preserve"> dengan bahasa baku, misalnya, </w:t>
-      </w:r>
-      <w:r>
-        <w:rPr>
-          <w:lang w:val="it-IT"/>
-        </w:rPr>
-        <w:t>Penulis A.F. mengucapkan terima kasih kepada Direktorat Pendidikan Tinggi, Departemen Pendidikan dan Kebudayaan Republik Indonesia yang telah memberikan dukungan finansial melalui Beas</w:t>
-      </w:r>
-      <w:r>
-        <w:rPr>
-          <w:lang w:val="it-IT"/>
-        </w:rPr>
-        <w:t>iswa Bidik Misi tahun 2010-2014</w:t>
-      </w:r>
-      <w:r>
-        <w:rPr>
-          <w:lang w:val="it-IT"/>
-        </w:rPr>
-        <w:t xml:space="preserve">. </w:t>
-      </w:r>
-      <w:r>
-        <w:rPr>
-          <w:lang w:val="it-IT"/>
-        </w:rPr>
-        <w:t>Penulis juga diperkenankan menyampaikan ucapan terima kasih kepada sp</w:t>
-      </w:r>
-      <w:r>
-        <w:rPr>
-          <w:lang w:val="it-IT"/>
-        </w:rPr>
-        <w:t>onsor penyedia dana penelitian.</w:t>
+        <w:t>Penulis mengucapkan terima kasih yang sebesar-besarnya kepada Ibu Dr. Dra. Kartika Fithriasari, M.Si. selaku dosen pembimbing, serta Bapak Prof. NUR Iriawan, M.Ikomp, Ph.D dan Ibu Tintrim Dwi Ary Widhianingsih, S.Si, M.Stat, Ph.D selaku dosen penguji atas segala bimbingan, arahan, serta masukannya yang sangat berharga dalam penyempurnaan Tugas Akhir ini. Penulis juga mengucapkan terima kasih kepada Fikri yang telah bersedia memfasilitasi tempat tinggal selama pengerjaan penelitian ini, serta rekan-rekan Statistika ITS atas dukungan moral dan kebersamaan yang diberikan.</w:t>
       </w:r>
     </w:p>
     <w:p>

</xml_diff>

<commit_message>
docs: revert Makalah back to original draft placeholder version
</commit_message>
<xml_diff>
--- a/Makalah dari Penyuka Idol Banyak Makan.docx
+++ b/Makalah dari Penyuka Idol Banyak Makan.docx
@@ -12449,7 +12449,46 @@
         </w:rPr>
       </w:pPr>
       <w:r>
-        <w:t>Penulis mengucapkan terima kasih yang sebesar-besarnya kepada Ibu Dr. Dra. Kartika Fithriasari, M.Si. selaku dosen pembimbing, serta Bapak Prof. NUR Iriawan, M.Ikomp, Ph.D dan Ibu Tintrim Dwi Ary Widhianingsih, S.Si, M.Stat, Ph.D selaku dosen penguji atas segala bimbingan, arahan, serta masukannya yang sangat berharga dalam penyempurnaan Tugas Akhir ini. Penulis juga mengucapkan terima kasih kepada Fikri yang telah bersedia memfasilitasi tempat tinggal selama pengerjaan penelitian ini, serta rekan-rekan Statistika ITS atas dukungan moral dan kebersamaan yang diberikan.</w:t>
+        <w:rPr>
+          <w:lang w:val="it-IT"/>
+        </w:rPr>
+        <w:t>Tuliskan ucapan terima kasih</w:t>
+      </w:r>
+      <w:r>
+        <w:rPr>
+          <w:lang w:val="it-IT"/>
+        </w:rPr>
+        <w:t xml:space="preserve"> dengan bahasa baku, misalnya, </w:t>
+      </w:r>
+      <w:r>
+        <w:rPr>
+          <w:lang w:val="it-IT"/>
+        </w:rPr>
+        <w:t>Penulis A.F. mengucapkan terima kasih kepada Direktorat Pendidikan Tinggi, Departemen Pendidikan dan Kebudayaan Republik Indonesia yang telah memberikan dukungan finansial melalui Beas</w:t>
+      </w:r>
+      <w:r>
+        <w:rPr>
+          <w:lang w:val="it-IT"/>
+        </w:rPr>
+        <w:t>iswa Bidik Misi tahun 2010-2014</w:t>
+      </w:r>
+      <w:r>
+        <w:rPr>
+          <w:lang w:val="it-IT"/>
+        </w:rPr>
+        <w:t xml:space="preserve">. </w:t>
+      </w:r>
+      <w:r>
+        <w:rPr>
+          <w:lang w:val="it-IT"/>
+        </w:rPr>
+        <w:t>Penulis juga diperkenankan menyampaikan ucapan terima kasih kepada sp</w:t>
+      </w:r>
+      <w:r>
+        <w:rPr>
+          <w:lang w:val="it-IT"/>
+        </w:rPr>
+        <w:t>onsor penyedia dana penelitian.</w:t>
       </w:r>
     </w:p>
     <w:p>

</xml_diff>